<commit_message>
Rename LaCyTools_summary to data
</commit_message>
<xml_diff>
--- a/GlycoDash_code_structure.docx
+++ b/GlycoDash_code_structure.docx
@@ -54,12 +54,14 @@
           <w:lang w:val="en-US"/>
         </w:rPr>
       </w:pPr>
+      <w:proofErr w:type="spellStart"/>
       <w:r>
         <w:rPr>
           <w:lang w:val="en-US"/>
         </w:rPr>
         <w:t>app_server.R</w:t>
       </w:r>
+      <w:proofErr w:type="spellEnd"/>
       <w:r>
         <w:rPr>
           <w:lang w:val="en-US"/>
@@ -95,12 +97,14 @@
           <w:lang w:val="en-US"/>
         </w:rPr>
       </w:pPr>
+      <w:proofErr w:type="spellStart"/>
       <w:r>
         <w:rPr>
           <w:lang w:val="en-US"/>
         </w:rPr>
         <w:t>app_ui.R</w:t>
       </w:r>
+      <w:proofErr w:type="spellEnd"/>
       <w:r>
         <w:rPr>
           <w:lang w:val="en-US"/>
@@ -179,20 +183,62 @@
         <w:rPr>
           <w:lang w:val="en-US"/>
         </w:rPr>
-        <w:t xml:space="preserve"> files contain the module ui and server functions.</w:t>
-      </w:r>
-    </w:p>
-    <w:p>
-      <w:pPr>
-        <w:rPr>
-          <w:lang w:val="en-US"/>
-        </w:rPr>
-      </w:pPr>
-      <w:r>
-        <w:rPr>
-          <w:lang w:val="en-US"/>
-        </w:rPr>
-        <w:t>‘mod_tab_’ files are modules in which the content of a tabPanel is created.</w:t>
+        <w:t xml:space="preserve"> files contain the module </w:t>
+      </w:r>
+      <w:proofErr w:type="spellStart"/>
+      <w:r>
+        <w:rPr>
+          <w:lang w:val="en-US"/>
+        </w:rPr>
+        <w:t>ui</w:t>
+      </w:r>
+      <w:proofErr w:type="spellEnd"/>
+      <w:r>
+        <w:rPr>
+          <w:lang w:val="en-US"/>
+        </w:rPr>
+        <w:t xml:space="preserve"> and server functions.</w:t>
+      </w:r>
+    </w:p>
+    <w:p>
+      <w:pPr>
+        <w:rPr>
+          <w:lang w:val="en-US"/>
+        </w:rPr>
+      </w:pPr>
+      <w:r>
+        <w:rPr>
+          <w:lang w:val="en-US"/>
+        </w:rPr>
+        <w:t>‘</w:t>
+      </w:r>
+      <w:proofErr w:type="spellStart"/>
+      <w:r>
+        <w:rPr>
+          <w:lang w:val="en-US"/>
+        </w:rPr>
+        <w:t>mod_tab</w:t>
+      </w:r>
+      <w:proofErr w:type="spellEnd"/>
+      <w:r>
+        <w:rPr>
+          <w:lang w:val="en-US"/>
+        </w:rPr>
+        <w:t xml:space="preserve">_’ files are modules in which the content of a </w:t>
+      </w:r>
+      <w:proofErr w:type="spellStart"/>
+      <w:r>
+        <w:rPr>
+          <w:lang w:val="en-US"/>
+        </w:rPr>
+        <w:t>tabPanel</w:t>
+      </w:r>
+      <w:proofErr w:type="spellEnd"/>
+      <w:r>
+        <w:rPr>
+          <w:lang w:val="en-US"/>
+        </w:rPr>
+        <w:t xml:space="preserve"> is created.</w:t>
       </w:r>
     </w:p>
     <w:p>
@@ -208,12 +254,21 @@
         </w:rPr>
         <w:t>‘</w:t>
       </w:r>
+      <w:proofErr w:type="spellStart"/>
       <w:r>
         <w:rPr>
           <w:color w:val="4472C4" w:themeColor="accent1"/>
           <w:lang w:val="en-US"/>
         </w:rPr>
-        <w:t>fct_</w:t>
+        <w:t>fct</w:t>
+      </w:r>
+      <w:proofErr w:type="spellEnd"/>
+      <w:r>
+        <w:rPr>
+          <w:color w:val="4472C4" w:themeColor="accent1"/>
+          <w:lang w:val="en-US"/>
+        </w:rPr>
+        <w:t>_</w:t>
       </w:r>
       <w:r>
         <w:rPr>
@@ -259,12 +314,14 @@
           <w:lang w:val="en-US"/>
         </w:rPr>
       </w:pPr>
+      <w:proofErr w:type="spellStart"/>
       <w:r>
         <w:rPr>
           <w:lang w:val="en-US"/>
         </w:rPr>
         <w:t>mod_data_import.R</w:t>
       </w:r>
+      <w:proofErr w:type="spellEnd"/>
     </w:p>
     <w:p>
       <w:pPr>
@@ -278,35 +335,77 @@
           <w:lang w:val="en-US"/>
         </w:rPr>
         <w:tab/>
-        <w:t>mod_read_lacytools.R</w:t>
-      </w:r>
+      </w:r>
+      <w:proofErr w:type="spellStart"/>
+      <w:r>
+        <w:rPr>
+          <w:lang w:val="en-US"/>
+        </w:rPr>
+        <w:t>mod_read_</w:t>
+      </w:r>
+      <w:r>
+        <w:rPr>
+          <w:lang w:val="en-US"/>
+        </w:rPr>
+        <w:t>data</w:t>
+      </w:r>
+      <w:r>
+        <w:rPr>
+          <w:lang w:val="en-US"/>
+        </w:rPr>
+        <w:t>.R</w:t>
+      </w:r>
+      <w:proofErr w:type="spellEnd"/>
       <w:r>
         <w:rPr>
           <w:lang w:val="en-US"/>
         </w:rPr>
         <w:t xml:space="preserve"> / </w:t>
       </w:r>
+      <w:proofErr w:type="spellStart"/>
       <w:r>
         <w:rPr>
           <w:color w:val="4472C4" w:themeColor="accent1"/>
           <w:lang w:val="en-US"/>
         </w:rPr>
-        <w:t>fct_read_lacytools.R</w:t>
-      </w:r>
-    </w:p>
-    <w:p>
-      <w:pPr>
-        <w:rPr>
-          <w:lang w:val="en-US"/>
-        </w:rPr>
-      </w:pPr>
-      <w:r>
-        <w:rPr>
-          <w:lang w:val="en-US"/>
-        </w:rPr>
-        <w:tab/>
+        <w:t>fct_read_</w:t>
+      </w:r>
+      <w:r>
+        <w:rPr>
+          <w:color w:val="4472C4" w:themeColor="accent1"/>
+          <w:lang w:val="en-US"/>
+        </w:rPr>
+        <w:t>data</w:t>
+      </w:r>
+      <w:r>
+        <w:rPr>
+          <w:color w:val="4472C4" w:themeColor="accent1"/>
+          <w:lang w:val="en-US"/>
+        </w:rPr>
+        <w:t>.R</w:t>
+      </w:r>
+      <w:proofErr w:type="spellEnd"/>
+    </w:p>
+    <w:p>
+      <w:pPr>
+        <w:rPr>
+          <w:lang w:val="en-US"/>
+        </w:rPr>
+      </w:pPr>
+      <w:r>
+        <w:rPr>
+          <w:lang w:val="en-US"/>
+        </w:rPr>
+        <w:tab/>
+      </w:r>
+      <w:proofErr w:type="spellStart"/>
+      <w:r>
+        <w:rPr>
+          <w:lang w:val="en-US"/>
+        </w:rPr>
         <w:t>mod_add_sample_ids.R</w:t>
       </w:r>
+      <w:proofErr w:type="spellEnd"/>
       <w:r>
         <w:rPr>
           <w:lang w:val="en-US"/>
@@ -319,6 +418,7 @@
         </w:rPr>
         <w:t xml:space="preserve">/ </w:t>
       </w:r>
+      <w:proofErr w:type="spellStart"/>
       <w:r>
         <w:rPr>
           <w:color w:val="4472C4" w:themeColor="accent1"/>
@@ -326,66 +426,89 @@
         </w:rPr>
         <w:t>fct_add_sample_ids.R</w:t>
       </w:r>
-    </w:p>
-    <w:p>
-      <w:pPr>
-        <w:rPr>
-          <w:lang w:val="en-US"/>
-        </w:rPr>
-      </w:pPr>
-      <w:r>
-        <w:rPr>
-          <w:lang w:val="en-US"/>
-        </w:rPr>
-        <w:tab/>
-      </w:r>
-      <w:r>
-        <w:rPr>
-          <w:lang w:val="en-US"/>
-        </w:rPr>
-        <w:tab/>
+      <w:proofErr w:type="spellEnd"/>
+    </w:p>
+    <w:p>
+      <w:pPr>
+        <w:rPr>
+          <w:lang w:val="en-US"/>
+        </w:rPr>
+      </w:pPr>
+      <w:r>
+        <w:rPr>
+          <w:lang w:val="en-US"/>
+        </w:rPr>
+        <w:tab/>
+      </w:r>
+      <w:r>
+        <w:rPr>
+          <w:lang w:val="en-US"/>
+        </w:rPr>
+        <w:tab/>
+      </w:r>
+      <w:proofErr w:type="spellStart"/>
+      <w:r>
+        <w:rPr>
+          <w:lang w:val="en-US"/>
+        </w:rPr>
         <w:t>mod_process_plate_design.R</w:t>
       </w:r>
-    </w:p>
-    <w:p>
-      <w:pPr>
-        <w:rPr>
-          <w:lang w:val="en-US"/>
-        </w:rPr>
-      </w:pPr>
-      <w:r>
-        <w:rPr>
-          <w:lang w:val="en-US"/>
-        </w:rPr>
-        <w:tab/>
-      </w:r>
-      <w:r>
-        <w:rPr>
-          <w:lang w:val="en-US"/>
-        </w:rPr>
-        <w:tab/>
+      <w:proofErr w:type="spellEnd"/>
+    </w:p>
+    <w:p>
+      <w:pPr>
+        <w:rPr>
+          <w:lang w:val="en-US"/>
+        </w:rPr>
+      </w:pPr>
+      <w:r>
+        <w:rPr>
+          <w:lang w:val="en-US"/>
+        </w:rPr>
+        <w:tab/>
+      </w:r>
+      <w:r>
+        <w:rPr>
+          <w:lang w:val="en-US"/>
+        </w:rPr>
+        <w:tab/>
+      </w:r>
+      <w:proofErr w:type="spellStart"/>
+      <w:r>
+        <w:rPr>
+          <w:lang w:val="en-US"/>
+        </w:rPr>
         <w:t>mod_process_sample_list.R</w:t>
       </w:r>
-    </w:p>
-    <w:p>
-      <w:pPr>
-        <w:rPr>
-          <w:lang w:val="en-US"/>
-        </w:rPr>
-      </w:pPr>
-      <w:r>
-        <w:rPr>
-          <w:lang w:val="en-US"/>
-        </w:rPr>
-        <w:tab/>
+      <w:proofErr w:type="spellEnd"/>
+    </w:p>
+    <w:p>
+      <w:pPr>
+        <w:rPr>
+          <w:lang w:val="en-US"/>
+        </w:rPr>
+      </w:pPr>
+      <w:r>
+        <w:rPr>
+          <w:lang w:val="en-US"/>
+        </w:rPr>
+        <w:tab/>
+      </w:r>
+      <w:proofErr w:type="spellStart"/>
+      <w:r>
+        <w:rPr>
+          <w:lang w:val="en-US"/>
+        </w:rPr>
         <w:t>mod_add_sample_types.R</w:t>
       </w:r>
+      <w:proofErr w:type="spellEnd"/>
       <w:r>
         <w:rPr>
           <w:lang w:val="en-US"/>
         </w:rPr>
         <w:t xml:space="preserve"> / </w:t>
       </w:r>
+      <w:proofErr w:type="spellStart"/>
       <w:r>
         <w:rPr>
           <w:color w:val="4472C4" w:themeColor="accent1"/>
@@ -393,150 +516,810 @@
         </w:rPr>
         <w:t>fct_add_sample_types.R</w:t>
       </w:r>
-      <w:r>
-        <w:rPr>
-          <w:lang w:val="en-US"/>
-        </w:rPr>
-        <w:tab/>
-      </w:r>
-    </w:p>
-    <w:p>
-      <w:pPr>
-        <w:rPr>
-          <w:lang w:val="en-US"/>
-        </w:rPr>
-      </w:pPr>
-      <w:r>
-        <w:rPr>
-          <w:lang w:val="en-US"/>
-        </w:rPr>
-        <w:tab/>
-      </w:r>
-      <w:r>
-        <w:rPr>
-          <w:lang w:val="en-US"/>
-        </w:rPr>
-        <w:tab/>
+      <w:proofErr w:type="spellEnd"/>
+      <w:r>
+        <w:rPr>
+          <w:lang w:val="en-US"/>
+        </w:rPr>
+        <w:tab/>
+      </w:r>
+    </w:p>
+    <w:p>
+      <w:pPr>
+        <w:rPr>
+          <w:lang w:val="en-US"/>
+        </w:rPr>
+      </w:pPr>
+      <w:r>
+        <w:rPr>
+          <w:lang w:val="en-US"/>
+        </w:rPr>
+        <w:tab/>
+      </w:r>
+      <w:r>
+        <w:rPr>
+          <w:lang w:val="en-US"/>
+        </w:rPr>
+        <w:tab/>
+      </w:r>
+      <w:proofErr w:type="spellStart"/>
+      <w:r>
+        <w:rPr>
+          <w:lang w:val="en-US"/>
+        </w:rPr>
         <w:t>mod_process_sample_type_file.R</w:t>
       </w:r>
-    </w:p>
-    <w:p>
-      <w:pPr>
-        <w:rPr>
-          <w:lang w:val="en-US"/>
-        </w:rPr>
-      </w:pPr>
-      <w:r>
-        <w:rPr>
-          <w:lang w:val="en-US"/>
-        </w:rPr>
-        <w:tab/>
-        <w:t>mod_add_clusters.R</w:t>
-      </w:r>
+      <w:proofErr w:type="spellEnd"/>
+    </w:p>
+    <w:p>
+      <w:pPr>
+        <w:rPr>
+          <w:lang w:val="en-US"/>
+        </w:rPr>
+      </w:pPr>
+      <w:r>
+        <w:rPr>
+          <w:lang w:val="en-US"/>
+        </w:rPr>
+        <w:tab/>
+      </w:r>
+      <w:proofErr w:type="spellStart"/>
+      <w:r>
+        <w:rPr>
+          <w:lang w:val="en-US"/>
+        </w:rPr>
+        <w:t>mod_clusters.R</w:t>
+      </w:r>
+      <w:proofErr w:type="spellEnd"/>
+      <w:r>
+        <w:rPr>
+          <w:lang w:val="en-US"/>
+        </w:rPr>
+        <w:tab/>
+      </w:r>
+    </w:p>
+    <w:p>
+      <w:pPr>
+        <w:rPr>
+          <w:lang w:val="en-US"/>
+        </w:rPr>
+      </w:pPr>
+      <w:r>
+        <w:rPr>
+          <w:lang w:val="en-US"/>
+        </w:rPr>
+        <w:tab/>
+      </w:r>
+      <w:proofErr w:type="spellStart"/>
+      <w:r>
+        <w:rPr>
+          <w:lang w:val="en-US"/>
+        </w:rPr>
+        <w:t>mod_add_metadata.R</w:t>
+      </w:r>
+      <w:proofErr w:type="spellEnd"/>
       <w:r>
         <w:rPr>
           <w:lang w:val="en-US"/>
         </w:rPr>
         <w:t xml:space="preserve"> / </w:t>
       </w:r>
+      <w:proofErr w:type="spellStart"/>
       <w:r>
         <w:rPr>
           <w:color w:val="4472C4" w:themeColor="accent1"/>
           <w:lang w:val="en-US"/>
         </w:rPr>
-        <w:t>fct_clusters.R</w:t>
-      </w:r>
-      <w:r>
-        <w:rPr>
-          <w:lang w:val="en-US"/>
-        </w:rPr>
-        <w:tab/>
-      </w:r>
-      <w:r>
-        <w:rPr>
-          <w:lang w:val="en-US"/>
-        </w:rPr>
-        <w:tab/>
-      </w:r>
-    </w:p>
-    <w:p>
-      <w:pPr>
-        <w:rPr>
-          <w:lang w:val="en-US"/>
-        </w:rPr>
-      </w:pPr>
-      <w:r>
-        <w:rPr>
-          <w:lang w:val="en-US"/>
-        </w:rPr>
-        <w:tab/>
-        <w:t>mod_add_metadata.R</w:t>
-      </w:r>
+        <w:t>fct_add_metadata.R</w:t>
+      </w:r>
+      <w:proofErr w:type="spellEnd"/>
+      <w:r>
+        <w:rPr>
+          <w:lang w:val="en-US"/>
+        </w:rPr>
+        <w:tab/>
+      </w:r>
+    </w:p>
+    <w:p>
+      <w:pPr>
+        <w:rPr>
+          <w:lang w:val="en-US"/>
+        </w:rPr>
+      </w:pPr>
+      <w:r>
+        <w:rPr>
+          <w:lang w:val="en-US"/>
+        </w:rPr>
+        <w:t xml:space="preserve"> </w:t>
+      </w:r>
+      <w:proofErr w:type="spellStart"/>
+      <w:r>
+        <w:rPr>
+          <w:lang w:val="en-US"/>
+        </w:rPr>
+        <w:t>mod_spectra_curation.R</w:t>
+      </w:r>
+      <w:proofErr w:type="spellEnd"/>
       <w:r>
         <w:rPr>
           <w:lang w:val="en-US"/>
         </w:rPr>
         <w:t xml:space="preserve"> / </w:t>
       </w:r>
+      <w:proofErr w:type="spellStart"/>
       <w:r>
         <w:rPr>
           <w:color w:val="4472C4" w:themeColor="accent1"/>
           <w:lang w:val="en-US"/>
         </w:rPr>
-        <w:t>fct_add_metadata.R</w:t>
-      </w:r>
-      <w:r>
-        <w:rPr>
-          <w:lang w:val="en-US"/>
-        </w:rPr>
-        <w:tab/>
-      </w:r>
-    </w:p>
-    <w:p>
-      <w:pPr>
-        <w:rPr>
-          <w:lang w:val="en-US"/>
-        </w:rPr>
-      </w:pPr>
+        <w:t>fct_spectra_curation.R</w:t>
+      </w:r>
+      <w:proofErr w:type="spellEnd"/>
+    </w:p>
+    <w:p>
+      <w:pPr>
+        <w:rPr>
+          <w:lang w:val="en-US"/>
+        </w:rPr>
+      </w:pPr>
+      <w:r>
+        <w:rPr>
+          <w:lang w:val="en-US"/>
+        </w:rPr>
+        <w:tab/>
+      </w:r>
+      <w:proofErr w:type="spellStart"/>
+      <w:r>
+        <w:rPr>
+          <w:lang w:val="en-US"/>
+        </w:rPr>
+        <w:t>mod_curate_based_on</w:t>
+      </w:r>
+      <w:proofErr w:type="spellEnd"/>
+      <w:r>
+        <w:rPr>
+          <w:lang w:val="en-US"/>
+        </w:rPr>
+        <w:t>_</w:t>
+      </w:r>
       <w:r>
         <w:rPr>
           <w:lang w:val="en-US"/>
         </w:rPr>
         <w:t xml:space="preserve"> </w:t>
       </w:r>
-      <w:r>
-        <w:rPr>
-          <w:lang w:val="en-US"/>
-        </w:rPr>
-        <w:t>mod_spectra_curation.R</w:t>
-      </w:r>
+      <w:proofErr w:type="spellStart"/>
+      <w:r>
+        <w:rPr>
+          <w:lang w:val="en-US"/>
+        </w:rPr>
+        <w:t>controls.R</w:t>
+      </w:r>
+      <w:proofErr w:type="spellEnd"/>
+    </w:p>
+    <w:p>
+      <w:pPr>
+        <w:rPr>
+          <w:lang w:val="en-US"/>
+        </w:rPr>
+      </w:pPr>
+      <w:r>
+        <w:rPr>
+          <w:lang w:val="en-US"/>
+        </w:rPr>
+        <w:tab/>
+      </w:r>
+      <w:proofErr w:type="spellStart"/>
+      <w:r>
+        <w:rPr>
+          <w:lang w:val="en-US"/>
+        </w:rPr>
+        <w:t>mod_curate_based_on_percentiles.R</w:t>
+      </w:r>
+      <w:proofErr w:type="spellEnd"/>
+    </w:p>
+    <w:p>
+      <w:pPr>
+        <w:rPr>
+          <w:lang w:val="en-US"/>
+        </w:rPr>
+      </w:pPr>
+      <w:r>
+        <w:rPr>
+          <w:lang w:val="en-US"/>
+        </w:rPr>
+        <w:tab/>
+      </w:r>
+      <w:proofErr w:type="spellStart"/>
+      <w:r>
+        <w:rPr>
+          <w:lang w:val="en-US"/>
+        </w:rPr>
+        <w:t>mod_tab_cut_offs.R</w:t>
+      </w:r>
+      <w:proofErr w:type="spellEnd"/>
+    </w:p>
+    <w:p>
+      <w:pPr>
+        <w:rPr>
+          <w:lang w:val="en-US"/>
+        </w:rPr>
+      </w:pPr>
+      <w:r>
+        <w:rPr>
+          <w:lang w:val="en-US"/>
+        </w:rPr>
+        <w:tab/>
+      </w:r>
+      <w:proofErr w:type="spellStart"/>
+      <w:r>
+        <w:rPr>
+          <w:lang w:val="en-US"/>
+        </w:rPr>
+        <w:t>mod_tab_curated_spectra_plot.R</w:t>
+      </w:r>
+      <w:proofErr w:type="spellEnd"/>
+    </w:p>
+    <w:p>
+      <w:pPr>
+        <w:rPr>
+          <w:lang w:val="en-US"/>
+        </w:rPr>
+      </w:pPr>
+      <w:proofErr w:type="spellStart"/>
+      <w:r>
+        <w:rPr>
+          <w:lang w:val="en-US"/>
+        </w:rPr>
+        <w:t>mod_analyte_curation.R</w:t>
+      </w:r>
+      <w:proofErr w:type="spellEnd"/>
       <w:r>
         <w:rPr>
           <w:lang w:val="en-US"/>
         </w:rPr>
         <w:t xml:space="preserve"> / </w:t>
       </w:r>
+      <w:proofErr w:type="spellStart"/>
       <w:r>
         <w:rPr>
           <w:color w:val="4472C4" w:themeColor="accent1"/>
           <w:lang w:val="en-US"/>
         </w:rPr>
-        <w:t>fct_spectra_curation.R</w:t>
-      </w:r>
-    </w:p>
-    <w:p>
-      <w:pPr>
-        <w:rPr>
-          <w:lang w:val="en-US"/>
-        </w:rPr>
-      </w:pPr>
-      <w:r>
-        <w:rPr>
-          <w:lang w:val="en-US"/>
-        </w:rPr>
-        <w:tab/>
-        <w:t>mod_curate_based_on_</w:t>
-      </w:r>
+        <w:t>fct_analyte_curation.R</w:t>
+      </w:r>
+      <w:proofErr w:type="spellEnd"/>
+    </w:p>
+    <w:p>
+      <w:pPr>
+        <w:rPr>
+          <w:color w:val="FF0000"/>
+          <w:lang w:val="en-US"/>
+        </w:rPr>
+      </w:pPr>
+      <w:r>
+        <w:rPr>
+          <w:lang w:val="en-US"/>
+        </w:rPr>
+        <w:tab/>
+      </w:r>
+      <w:proofErr w:type="spellStart"/>
+      <w:r>
+        <w:rPr>
+          <w:lang w:val="en-US"/>
+        </w:rPr>
+        <w:t>mod_</w:t>
+      </w:r>
+      <w:r>
+        <w:rPr>
+          <w:lang w:val="en-US"/>
+        </w:rPr>
+        <w:t>tab_curated_analytes.R</w:t>
+      </w:r>
+      <w:proofErr w:type="spellEnd"/>
+    </w:p>
+    <w:p>
+      <w:pPr>
+        <w:rPr>
+          <w:color w:val="4472C4" w:themeColor="accent1"/>
+          <w:lang w:val="en-US"/>
+        </w:rPr>
+      </w:pPr>
+      <w:proofErr w:type="spellStart"/>
+      <w:r>
+        <w:rPr>
+          <w:lang w:val="en-US"/>
+        </w:rPr>
+        <w:t>mod_normalization.R</w:t>
+      </w:r>
+      <w:proofErr w:type="spellEnd"/>
+      <w:r>
+        <w:rPr>
+          <w:lang w:val="en-US"/>
+        </w:rPr>
+        <w:t xml:space="preserve"> / </w:t>
+      </w:r>
+      <w:proofErr w:type="spellStart"/>
+      <w:r>
+        <w:rPr>
+          <w:color w:val="4472C4" w:themeColor="accent1"/>
+          <w:lang w:val="en-US"/>
+        </w:rPr>
+        <w:t>fct_normalization.R</w:t>
+      </w:r>
+      <w:proofErr w:type="spellEnd"/>
+    </w:p>
+    <w:p>
+      <w:pPr>
+        <w:rPr>
+          <w:color w:val="4472C4" w:themeColor="accent1"/>
+          <w:lang w:val="en-US"/>
+        </w:rPr>
+      </w:pPr>
+      <w:proofErr w:type="spellStart"/>
+      <w:r>
+        <w:rPr>
+          <w:lang w:val="en-US"/>
+        </w:rPr>
+        <w:t>mod_quantitation.R</w:t>
+      </w:r>
+      <w:proofErr w:type="spellEnd"/>
+      <w:r>
+        <w:rPr>
+          <w:lang w:val="en-US"/>
+        </w:rPr>
+        <w:t xml:space="preserve"> / </w:t>
+      </w:r>
+      <w:proofErr w:type="spellStart"/>
+      <w:r>
+        <w:rPr>
+          <w:color w:val="4472C4" w:themeColor="accent1"/>
+          <w:lang w:val="en-US"/>
+        </w:rPr>
+        <w:t>fct_quantitation.R</w:t>
+      </w:r>
+      <w:proofErr w:type="spellEnd"/>
+    </w:p>
+    <w:p>
+      <w:pPr>
+        <w:rPr>
+          <w:lang w:val="en-US"/>
+        </w:rPr>
+      </w:pPr>
+      <w:r>
+        <w:rPr>
+          <w:color w:val="4472C4" w:themeColor="accent1"/>
+          <w:lang w:val="en-US"/>
+        </w:rPr>
+        <w:tab/>
+      </w:r>
+      <w:proofErr w:type="spellStart"/>
+      <w:r>
+        <w:rPr>
+          <w:lang w:val="en-US"/>
+        </w:rPr>
+        <w:t>mod_tab_quantit</w:t>
+      </w:r>
+      <w:r>
+        <w:rPr>
+          <w:lang w:val="en-US"/>
+        </w:rPr>
+        <w:t>ation</w:t>
+      </w:r>
+      <w:r>
+        <w:rPr>
+          <w:lang w:val="en-US"/>
+        </w:rPr>
+        <w:t>.R</w:t>
+      </w:r>
+      <w:proofErr w:type="spellEnd"/>
+    </w:p>
+    <w:p>
+      <w:pPr>
+        <w:rPr>
+          <w:lang w:val="en-US"/>
+        </w:rPr>
+      </w:pPr>
+      <w:r>
+        <w:rPr>
+          <w:lang w:val="en-US"/>
+        </w:rPr>
+        <w:tab/>
+      </w:r>
+      <w:proofErr w:type="spellStart"/>
+      <w:r>
+        <w:rPr>
+          <w:lang w:val="en-US"/>
+        </w:rPr>
+        <w:t>mod_tab_quantitation_peptides.R</w:t>
+      </w:r>
+      <w:proofErr w:type="spellEnd"/>
+    </w:p>
+    <w:p>
+      <w:pPr>
+        <w:rPr>
+          <w:color w:val="4472C4" w:themeColor="accent1"/>
+          <w:lang w:val="en-US"/>
+        </w:rPr>
+      </w:pPr>
+      <w:proofErr w:type="spellStart"/>
+      <w:r>
+        <w:rPr>
+          <w:lang w:val="en-US"/>
+        </w:rPr>
+        <w:t>mod_derived_traits.R</w:t>
+      </w:r>
+      <w:proofErr w:type="spellEnd"/>
+      <w:r>
+        <w:rPr>
+          <w:lang w:val="en-US"/>
+        </w:rPr>
+        <w:t xml:space="preserve"> / </w:t>
+      </w:r>
+      <w:proofErr w:type="spellStart"/>
+      <w:r>
+        <w:rPr>
+          <w:color w:val="4472C4" w:themeColor="accent1"/>
+          <w:lang w:val="en-US"/>
+        </w:rPr>
+        <w:t>fct_derived_traits.R</w:t>
+      </w:r>
+      <w:proofErr w:type="spellEnd"/>
+    </w:p>
+    <w:p>
+      <w:pPr>
+        <w:rPr>
+          <w:lang w:val="en-US"/>
+        </w:rPr>
+      </w:pPr>
+      <w:r>
+        <w:rPr>
+          <w:color w:val="4472C4" w:themeColor="accent1"/>
+          <w:lang w:val="en-US"/>
+        </w:rPr>
+        <w:lastRenderedPageBreak/>
+        <w:tab/>
+      </w:r>
+      <w:proofErr w:type="spellStart"/>
+      <w:r>
+        <w:rPr>
+          <w:lang w:val="en-US"/>
+        </w:rPr>
+        <w:t>mod_tab_intensities.R</w:t>
+      </w:r>
+      <w:proofErr w:type="spellEnd"/>
+    </w:p>
+    <w:p>
+      <w:pPr>
+        <w:rPr>
+          <w:lang w:val="en-US"/>
+        </w:rPr>
+      </w:pPr>
+      <w:proofErr w:type="spellStart"/>
+      <w:r>
+        <w:rPr>
+          <w:lang w:val="en-US"/>
+        </w:rPr>
+        <w:t>mod_site_occupancy.R</w:t>
+      </w:r>
+      <w:proofErr w:type="spellEnd"/>
+      <w:r>
+        <w:rPr>
+          <w:lang w:val="en-US"/>
+        </w:rPr>
+        <w:t xml:space="preserve"> / </w:t>
+      </w:r>
+      <w:proofErr w:type="spellStart"/>
+      <w:r>
+        <w:rPr>
+          <w:color w:val="4472C4" w:themeColor="accent1"/>
+          <w:lang w:val="en-US"/>
+        </w:rPr>
+        <w:t>fct_site_occupancy.R</w:t>
+      </w:r>
+      <w:proofErr w:type="spellEnd"/>
+    </w:p>
+    <w:p>
+      <w:pPr>
+        <w:rPr>
+          <w:color w:val="4472C4" w:themeColor="accent1"/>
+          <w:lang w:val="en-US"/>
+        </w:rPr>
+      </w:pPr>
+      <w:proofErr w:type="spellStart"/>
+      <w:r>
+        <w:rPr>
+          <w:lang w:val="en-US"/>
+        </w:rPr>
+        <w:t>mod_repeatability.R</w:t>
+      </w:r>
+      <w:proofErr w:type="spellEnd"/>
+      <w:r>
+        <w:rPr>
+          <w:lang w:val="en-US"/>
+        </w:rPr>
+        <w:t xml:space="preserve"> / </w:t>
+      </w:r>
+      <w:proofErr w:type="spellStart"/>
+      <w:r>
+        <w:rPr>
+          <w:color w:val="4472C4" w:themeColor="accent1"/>
+          <w:lang w:val="en-US"/>
+        </w:rPr>
+        <w:t>fct_repeatability.R</w:t>
+      </w:r>
+      <w:proofErr w:type="spellEnd"/>
+    </w:p>
+    <w:p>
+      <w:pPr>
+        <w:rPr>
+          <w:lang w:val="en-US"/>
+        </w:rPr>
+      </w:pPr>
+      <w:r>
+        <w:rPr>
+          <w:color w:val="4472C4" w:themeColor="accent1"/>
+          <w:lang w:val="en-US"/>
+        </w:rPr>
+        <w:tab/>
+      </w:r>
+      <w:proofErr w:type="spellStart"/>
+      <w:r>
+        <w:rPr>
+          <w:lang w:val="en-US"/>
+        </w:rPr>
+        <w:t>mod_tab_repeatability.R</w:t>
+      </w:r>
+      <w:proofErr w:type="spellEnd"/>
+    </w:p>
+    <w:p>
+      <w:pPr>
+        <w:rPr>
+          <w:lang w:val="en-US"/>
+        </w:rPr>
+      </w:pPr>
+      <w:r>
+        <w:rPr>
+          <w:lang w:val="en-US"/>
+        </w:rPr>
+        <w:tab/>
+      </w:r>
+      <w:r>
+        <w:rPr>
+          <w:lang w:val="en-US"/>
+        </w:rPr>
+        <w:tab/>
+      </w:r>
+      <w:proofErr w:type="spellStart"/>
+      <w:r>
+        <w:rPr>
+          <w:lang w:val="en-US"/>
+        </w:rPr>
+        <w:t>mod_tab_repeatability_plot.R</w:t>
+      </w:r>
+      <w:proofErr w:type="spellEnd"/>
+    </w:p>
+    <w:p>
+      <w:pPr>
+        <w:rPr>
+          <w:lang w:val="en-US"/>
+        </w:rPr>
+      </w:pPr>
+      <w:proofErr w:type="spellStart"/>
+      <w:r>
+        <w:rPr>
+          <w:lang w:val="en-US"/>
+        </w:rPr>
+        <w:t>mod_data_exploration.R</w:t>
+      </w:r>
+      <w:proofErr w:type="spellEnd"/>
+      <w:r>
+        <w:rPr>
+          <w:lang w:val="en-US"/>
+        </w:rPr>
+        <w:t xml:space="preserve"> / </w:t>
+      </w:r>
+      <w:proofErr w:type="spellStart"/>
+      <w:r>
+        <w:rPr>
+          <w:color w:val="4472C4" w:themeColor="accent1"/>
+          <w:lang w:val="en-US"/>
+        </w:rPr>
+        <w:t>fct_data_exploration.R</w:t>
+      </w:r>
+      <w:proofErr w:type="spellEnd"/>
+    </w:p>
+    <w:p>
+      <w:pPr>
+        <w:rPr>
+          <w:lang w:val="en-US"/>
+        </w:rPr>
+      </w:pPr>
+      <w:r>
+        <w:rPr>
+          <w:lang w:val="en-US"/>
+        </w:rPr>
+        <w:tab/>
+      </w:r>
+      <w:proofErr w:type="spellStart"/>
+      <w:r>
+        <w:rPr>
+          <w:lang w:val="en-US"/>
+        </w:rPr>
+        <w:t>mod_tab_data_exploration.R</w:t>
+      </w:r>
+      <w:proofErr w:type="spellEnd"/>
+    </w:p>
+    <w:p>
+      <w:pPr>
+        <w:rPr>
+          <w:lang w:val="en-US"/>
+        </w:rPr>
+      </w:pPr>
+      <w:proofErr w:type="spellStart"/>
+      <w:r>
+        <w:rPr>
+          <w:lang w:val="en-US"/>
+        </w:rPr>
+        <w:t>mod_export.</w:t>
+      </w:r>
+      <w:r>
+        <w:rPr>
+          <w:lang w:val="en-US"/>
+        </w:rPr>
+        <w:t>R</w:t>
+      </w:r>
+      <w:proofErr w:type="spellEnd"/>
+    </w:p>
+    <w:p>
+      <w:pPr>
+        <w:rPr>
+          <w:lang w:val="en-US"/>
+        </w:rPr>
+      </w:pPr>
+    </w:p>
+    <w:p>
+      <w:pPr>
+        <w:rPr>
+          <w:lang w:val="en-US"/>
+        </w:rPr>
+      </w:pPr>
+      <w:r>
+        <w:rPr>
+          <w:lang w:val="en-US"/>
+        </w:rPr>
+        <w:t xml:space="preserve">All functions (except small helper functions) within the </w:t>
+      </w:r>
+      <w:proofErr w:type="spellStart"/>
+      <w:r>
+        <w:rPr>
+          <w:color w:val="4472C4" w:themeColor="accent1"/>
+          <w:lang w:val="en-US"/>
+        </w:rPr>
+        <w:t>fct</w:t>
+      </w:r>
+      <w:proofErr w:type="spellEnd"/>
+      <w:r>
+        <w:rPr>
+          <w:color w:val="4472C4" w:themeColor="accent1"/>
+          <w:lang w:val="en-US"/>
+        </w:rPr>
+        <w:t>_</w:t>
+      </w:r>
+      <w:r>
+        <w:rPr>
+          <w:lang w:val="en-US"/>
+        </w:rPr>
+        <w:t xml:space="preserve"> files are documented using the roxygen2 package. To view the documentation as a help page run ‘golem::</w:t>
+      </w:r>
+      <w:proofErr w:type="spellStart"/>
+      <w:r>
+        <w:rPr>
+          <w:lang w:val="en-US"/>
+        </w:rPr>
+        <w:t>document_and_reload</w:t>
+      </w:r>
+      <w:proofErr w:type="spellEnd"/>
+      <w:r>
+        <w:rPr>
+          <w:lang w:val="en-US"/>
+        </w:rPr>
+        <w:t>()’</w:t>
+      </w:r>
+      <w:r>
+        <w:rPr>
+          <w:lang w:val="en-US"/>
+        </w:rPr>
+        <w:t>. Then run ? followed by the function name as you would with regular R functions.</w:t>
+      </w:r>
+    </w:p>
+    <w:p>
+      <w:pPr>
+        <w:rPr>
+          <w:lang w:val="en-US"/>
+        </w:rPr>
+      </w:pPr>
+    </w:p>
+    <w:p>
+      <w:pPr>
+        <w:pStyle w:val="Heading2"/>
+        <w:rPr>
+          <w:lang w:val="en-US"/>
+        </w:rPr>
+      </w:pPr>
+      <w:r>
+        <w:rPr>
+          <w:lang w:val="en-US"/>
+        </w:rPr>
+        <w:t>Default golem files</w:t>
+      </w:r>
+    </w:p>
+    <w:p>
+      <w:pPr>
+        <w:rPr>
+          <w:lang w:val="en-US"/>
+        </w:rPr>
+      </w:pPr>
+      <w:proofErr w:type="spellStart"/>
+      <w:r>
+        <w:rPr>
+          <w:lang w:val="en-US"/>
+        </w:rPr>
+        <w:t>app_config.R</w:t>
+      </w:r>
+      <w:proofErr w:type="spellEnd"/>
+      <w:r>
+        <w:rPr>
+          <w:lang w:val="en-US"/>
+        </w:rPr>
+        <w:tab/>
+      </w:r>
+      <w:r>
+        <w:rPr>
+          <w:lang w:val="en-US"/>
+        </w:rPr>
+        <w:tab/>
+        <w:t>Default golem file, don’t change.</w:t>
+      </w:r>
+    </w:p>
+    <w:p>
+      <w:pPr>
+        <w:ind w:left="2124" w:hanging="2124"/>
+        <w:rPr>
+          <w:lang w:val="en-US"/>
+        </w:rPr>
+      </w:pPr>
+      <w:proofErr w:type="spellStart"/>
+      <w:r>
+        <w:rPr>
+          <w:lang w:val="en-US"/>
+        </w:rPr>
+        <w:t>golem_utils_server.R</w:t>
+      </w:r>
+      <w:proofErr w:type="spellEnd"/>
+      <w:r>
+        <w:rPr>
+          <w:lang w:val="en-US"/>
+        </w:rPr>
+        <w:tab/>
+        <w:t>Contains default golem functions you can use in your server functions, I didn’t use these, just ignore.</w:t>
+      </w:r>
+    </w:p>
+    <w:p>
+      <w:pPr>
+        <w:ind w:left="2124" w:hanging="2124"/>
+        <w:rPr>
+          <w:lang w:val="en-US"/>
+        </w:rPr>
+      </w:pPr>
+      <w:proofErr w:type="spellStart"/>
+      <w:r>
+        <w:rPr>
+          <w:lang w:val="en-US"/>
+        </w:rPr>
+        <w:t>golem_utils_ui.R</w:t>
+      </w:r>
+      <w:proofErr w:type="spellEnd"/>
       <w:r>
         <w:rPr>
           <w:lang w:val="en-US"/>
@@ -547,403 +1330,50 @@
         <w:rPr>
           <w:lang w:val="en-US"/>
         </w:rPr>
-        <w:t>controls.R</w:t>
-      </w:r>
-    </w:p>
-    <w:p>
-      <w:pPr>
-        <w:rPr>
-          <w:lang w:val="en-US"/>
-        </w:rPr>
-      </w:pPr>
-      <w:r>
-        <w:rPr>
-          <w:lang w:val="en-US"/>
-        </w:rPr>
-        <w:tab/>
-        <w:t>mod_curate_based_on_percentiles.R</w:t>
-      </w:r>
-    </w:p>
-    <w:p>
-      <w:pPr>
-        <w:rPr>
-          <w:lang w:val="en-US"/>
-        </w:rPr>
-      </w:pPr>
-      <w:r>
-        <w:rPr>
-          <w:lang w:val="en-US"/>
-        </w:rPr>
-        <w:tab/>
-        <w:t>mod_tab_cut_offs.R</w:t>
-      </w:r>
-    </w:p>
-    <w:p>
-      <w:pPr>
-        <w:rPr>
-          <w:lang w:val="en-US"/>
-        </w:rPr>
-      </w:pPr>
-      <w:r>
-        <w:rPr>
-          <w:lang w:val="en-US"/>
-        </w:rPr>
-        <w:tab/>
-        <w:t>mod_tab_curated_spectra_plot.R</w:t>
-      </w:r>
-    </w:p>
-    <w:p>
-      <w:pPr>
-        <w:rPr>
-          <w:lang w:val="en-US"/>
-        </w:rPr>
-      </w:pPr>
-      <w:r>
-        <w:rPr>
-          <w:lang w:val="en-US"/>
-        </w:rPr>
-        <w:t xml:space="preserve">mod_analyte_curation.R / </w:t>
-      </w:r>
-      <w:r>
-        <w:rPr>
-          <w:color w:val="4472C4" w:themeColor="accent1"/>
-          <w:lang w:val="en-US"/>
-        </w:rPr>
-        <w:t>fct_analyte_curation.R</w:t>
-      </w:r>
-    </w:p>
-    <w:p>
-      <w:pPr>
-        <w:rPr>
-          <w:color w:val="FF0000"/>
-          <w:lang w:val="en-US"/>
-        </w:rPr>
-      </w:pPr>
-      <w:r>
-        <w:rPr>
-          <w:lang w:val="en-US"/>
-        </w:rPr>
-        <w:tab/>
-        <w:t>mod_</w:t>
-      </w:r>
-      <w:r>
-        <w:rPr>
-          <w:lang w:val="en-US"/>
-        </w:rPr>
-        <w:t>tab_curated_analytes.R</w:t>
-      </w:r>
-    </w:p>
-    <w:p>
-      <w:pPr>
-        <w:rPr>
-          <w:color w:val="4472C4" w:themeColor="accent1"/>
-          <w:lang w:val="en-US"/>
-        </w:rPr>
-      </w:pPr>
-      <w:r>
-        <w:rPr>
-          <w:lang w:val="en-US"/>
-        </w:rPr>
-        <w:t>mod_normalization.R</w:t>
-      </w:r>
-      <w:r>
-        <w:rPr>
-          <w:lang w:val="en-US"/>
-        </w:rPr>
-        <w:t xml:space="preserve"> / </w:t>
-      </w:r>
-      <w:r>
-        <w:rPr>
-          <w:color w:val="4472C4" w:themeColor="accent1"/>
-          <w:lang w:val="en-US"/>
-        </w:rPr>
-        <w:t>fct_normalization.R</w:t>
-      </w:r>
-    </w:p>
-    <w:p>
-      <w:pPr>
-        <w:rPr>
-          <w:color w:val="4472C4" w:themeColor="accent1"/>
-          <w:lang w:val="en-US"/>
-        </w:rPr>
-      </w:pPr>
-      <w:r>
-        <w:rPr>
-          <w:lang w:val="en-US"/>
-        </w:rPr>
-        <w:t xml:space="preserve">mod_quantitation.R / </w:t>
-      </w:r>
-      <w:r>
-        <w:rPr>
-          <w:color w:val="4472C4" w:themeColor="accent1"/>
-          <w:lang w:val="en-US"/>
-        </w:rPr>
-        <w:t>fct_quantitation.R</w:t>
-      </w:r>
-    </w:p>
-    <w:p>
-      <w:pPr>
-        <w:rPr>
-          <w:lang w:val="en-US"/>
-        </w:rPr>
-      </w:pPr>
-      <w:r>
-        <w:rPr>
-          <w:color w:val="4472C4" w:themeColor="accent1"/>
-          <w:lang w:val="en-US"/>
-        </w:rPr>
-        <w:tab/>
-      </w:r>
-      <w:r>
-        <w:rPr>
-          <w:lang w:val="en-US"/>
-        </w:rPr>
-        <w:t>mod_tab_quantit</w:t>
-      </w:r>
-      <w:r>
-        <w:rPr>
-          <w:lang w:val="en-US"/>
-        </w:rPr>
-        <w:t>ation</w:t>
-      </w:r>
-      <w:r>
-        <w:rPr>
-          <w:lang w:val="en-US"/>
-        </w:rPr>
-        <w:t>.R</w:t>
-      </w:r>
-    </w:p>
-    <w:p>
-      <w:pPr>
-        <w:rPr>
-          <w:lang w:val="en-US"/>
-        </w:rPr>
-      </w:pPr>
-      <w:r>
-        <w:rPr>
-          <w:lang w:val="en-US"/>
-        </w:rPr>
-        <w:tab/>
-        <w:t>mod_tab_quantitation_peptides.R</w:t>
-      </w:r>
-    </w:p>
-    <w:p>
-      <w:pPr>
-        <w:rPr>
-          <w:color w:val="4472C4" w:themeColor="accent1"/>
-          <w:lang w:val="en-US"/>
-        </w:rPr>
-      </w:pPr>
-      <w:r>
-        <w:rPr>
-          <w:lang w:val="en-US"/>
-        </w:rPr>
-        <w:t xml:space="preserve">mod_derived_traits.R / </w:t>
-      </w:r>
-      <w:r>
-        <w:rPr>
-          <w:color w:val="4472C4" w:themeColor="accent1"/>
-          <w:lang w:val="en-US"/>
-        </w:rPr>
-        <w:t>fct_derived_traits.R</w:t>
-      </w:r>
-    </w:p>
-    <w:p>
-      <w:pPr>
-        <w:rPr>
-          <w:lang w:val="en-US"/>
-        </w:rPr>
-      </w:pPr>
-      <w:r>
-        <w:rPr>
-          <w:color w:val="4472C4" w:themeColor="accent1"/>
-          <w:lang w:val="en-US"/>
-        </w:rPr>
-        <w:lastRenderedPageBreak/>
-        <w:tab/>
-      </w:r>
-      <w:r>
-        <w:rPr>
-          <w:lang w:val="en-US"/>
-        </w:rPr>
-        <w:t>mod_tab_intensities.R</w:t>
-      </w:r>
-    </w:p>
-    <w:p>
-      <w:pPr>
-        <w:rPr>
-          <w:lang w:val="en-US"/>
-        </w:rPr>
-      </w:pPr>
-      <w:r>
-        <w:rPr>
-          <w:lang w:val="en-US"/>
-        </w:rPr>
-        <w:t xml:space="preserve">mod_site_occupancy.R / </w:t>
-      </w:r>
-      <w:r>
-        <w:rPr>
-          <w:color w:val="4472C4" w:themeColor="accent1"/>
-          <w:lang w:val="en-US"/>
-        </w:rPr>
-        <w:t>fct_site_occupancy.R</w:t>
-      </w:r>
-    </w:p>
-    <w:p>
-      <w:pPr>
-        <w:rPr>
-          <w:color w:val="4472C4" w:themeColor="accent1"/>
-          <w:lang w:val="en-US"/>
-        </w:rPr>
-      </w:pPr>
-      <w:r>
-        <w:rPr>
-          <w:lang w:val="en-US"/>
-        </w:rPr>
-        <w:t xml:space="preserve">mod_repeatability.R / </w:t>
-      </w:r>
-      <w:r>
-        <w:rPr>
-          <w:color w:val="4472C4" w:themeColor="accent1"/>
-          <w:lang w:val="en-US"/>
-        </w:rPr>
-        <w:t>fct_repeatability.R</w:t>
-      </w:r>
-    </w:p>
-    <w:p>
-      <w:pPr>
-        <w:rPr>
-          <w:lang w:val="en-US"/>
-        </w:rPr>
-      </w:pPr>
-      <w:r>
-        <w:rPr>
-          <w:color w:val="4472C4" w:themeColor="accent1"/>
-          <w:lang w:val="en-US"/>
-        </w:rPr>
-        <w:tab/>
-      </w:r>
-      <w:r>
-        <w:rPr>
-          <w:lang w:val="en-US"/>
-        </w:rPr>
-        <w:t>mod_tab_repeatability.R</w:t>
-      </w:r>
-    </w:p>
-    <w:p>
-      <w:pPr>
-        <w:rPr>
-          <w:lang w:val="en-US"/>
-        </w:rPr>
-      </w:pPr>
-      <w:r>
-        <w:rPr>
-          <w:lang w:val="en-US"/>
-        </w:rPr>
-        <w:tab/>
-      </w:r>
-      <w:r>
-        <w:rPr>
-          <w:lang w:val="en-US"/>
-        </w:rPr>
-        <w:tab/>
-        <w:t>mod_tab_repeatability_plot.R</w:t>
-      </w:r>
-    </w:p>
-    <w:p>
-      <w:pPr>
-        <w:rPr>
-          <w:lang w:val="en-US"/>
-        </w:rPr>
-      </w:pPr>
-      <w:r>
-        <w:rPr>
-          <w:lang w:val="en-US"/>
-        </w:rPr>
-        <w:t xml:space="preserve">mod_data_exploration.R / </w:t>
-      </w:r>
-      <w:r>
-        <w:rPr>
-          <w:color w:val="4472C4" w:themeColor="accent1"/>
-          <w:lang w:val="en-US"/>
-        </w:rPr>
-        <w:t>fct_data_exploration.R</w:t>
-      </w:r>
-    </w:p>
-    <w:p>
-      <w:pPr>
-        <w:rPr>
-          <w:lang w:val="en-US"/>
-        </w:rPr>
-      </w:pPr>
-      <w:r>
-        <w:rPr>
-          <w:lang w:val="en-US"/>
-        </w:rPr>
-        <w:tab/>
-        <w:t>mod_tab_data_exploration.R</w:t>
-      </w:r>
-    </w:p>
-    <w:p>
-      <w:pPr>
-        <w:rPr>
-          <w:lang w:val="en-US"/>
-        </w:rPr>
-      </w:pPr>
-      <w:r>
-        <w:rPr>
-          <w:lang w:val="en-US"/>
-        </w:rPr>
-        <w:t>mod_export.</w:t>
-      </w:r>
-      <w:r>
-        <w:rPr>
-          <w:lang w:val="en-US"/>
-        </w:rPr>
-        <w:t>R</w:t>
-      </w:r>
-    </w:p>
-    <w:p>
-      <w:pPr>
-        <w:rPr>
-          <w:lang w:val="en-US"/>
-        </w:rPr>
-      </w:pPr>
-    </w:p>
-    <w:p>
-      <w:pPr>
-        <w:rPr>
-          <w:lang w:val="en-US"/>
-        </w:rPr>
-      </w:pPr>
-      <w:r>
-        <w:rPr>
-          <w:lang w:val="en-US"/>
-        </w:rPr>
-        <w:t xml:space="preserve">All functions (except small helper functions) within the </w:t>
-      </w:r>
-      <w:r>
-        <w:rPr>
-          <w:color w:val="4472C4" w:themeColor="accent1"/>
-          <w:lang w:val="en-US"/>
-        </w:rPr>
-        <w:t>fct_</w:t>
-      </w:r>
-      <w:r>
-        <w:rPr>
-          <w:lang w:val="en-US"/>
-        </w:rPr>
-        <w:t xml:space="preserve"> files are documented using the roxygen2 package. To view the documentation as a help page run ‘golem::document_and_reload()’</w:t>
-      </w:r>
-      <w:r>
-        <w:rPr>
-          <w:lang w:val="en-US"/>
-        </w:rPr>
-        <w:t>. Then run ? followed by the function name as you would with regular R functions.</w:t>
-      </w:r>
-    </w:p>
-    <w:p>
-      <w:pPr>
+        <w:tab/>
+        <w:t xml:space="preserve">Same as above, but for </w:t>
+      </w:r>
+      <w:proofErr w:type="spellStart"/>
+      <w:r>
+        <w:rPr>
+          <w:lang w:val="en-US"/>
+        </w:rPr>
+        <w:t>ui</w:t>
+      </w:r>
+      <w:proofErr w:type="spellEnd"/>
+      <w:r>
+        <w:rPr>
+          <w:lang w:val="en-US"/>
+        </w:rPr>
+        <w:t xml:space="preserve"> functions.</w:t>
+      </w:r>
+    </w:p>
+    <w:p>
+      <w:pPr>
+        <w:ind w:left="2124" w:hanging="2124"/>
+        <w:rPr>
+          <w:lang w:val="en-US"/>
+        </w:rPr>
+      </w:pPr>
+      <w:proofErr w:type="spellStart"/>
+      <w:r>
+        <w:rPr>
+          <w:lang w:val="en-US"/>
+        </w:rPr>
+        <w:t>run_app.R</w:t>
+      </w:r>
+      <w:proofErr w:type="spellEnd"/>
+      <w:r>
+        <w:rPr>
+          <w:lang w:val="en-US"/>
+        </w:rPr>
+        <w:tab/>
+        <w:t>File used to launch your app, don’t change.</w:t>
+      </w:r>
+    </w:p>
+    <w:p>
+      <w:pPr>
+        <w:ind w:left="2124" w:hanging="2124"/>
         <w:rPr>
           <w:lang w:val="en-US"/>
         </w:rPr>
@@ -960,117 +1390,6 @@
         <w:rPr>
           <w:lang w:val="en-US"/>
         </w:rPr>
-        <w:t>Default golem files</w:t>
-      </w:r>
-    </w:p>
-    <w:p>
-      <w:pPr>
-        <w:rPr>
-          <w:lang w:val="en-US"/>
-        </w:rPr>
-      </w:pPr>
-      <w:r>
-        <w:rPr>
-          <w:lang w:val="en-US"/>
-        </w:rPr>
-        <w:t>app_config.R</w:t>
-      </w:r>
-      <w:r>
-        <w:rPr>
-          <w:lang w:val="en-US"/>
-        </w:rPr>
-        <w:tab/>
-      </w:r>
-      <w:r>
-        <w:rPr>
-          <w:lang w:val="en-US"/>
-        </w:rPr>
-        <w:tab/>
-        <w:t>Default golem file, don’t change.</w:t>
-      </w:r>
-    </w:p>
-    <w:p>
-      <w:pPr>
-        <w:ind w:left="2124" w:hanging="2124"/>
-        <w:rPr>
-          <w:lang w:val="en-US"/>
-        </w:rPr>
-      </w:pPr>
-      <w:r>
-        <w:rPr>
-          <w:lang w:val="en-US"/>
-        </w:rPr>
-        <w:t>golem_utils_server.R</w:t>
-      </w:r>
-      <w:r>
-        <w:rPr>
-          <w:lang w:val="en-US"/>
-        </w:rPr>
-        <w:tab/>
-        <w:t>Contains default golem functions you can use in your server functions, I didn’t use these, just ignore.</w:t>
-      </w:r>
-    </w:p>
-    <w:p>
-      <w:pPr>
-        <w:ind w:left="2124" w:hanging="2124"/>
-        <w:rPr>
-          <w:lang w:val="en-US"/>
-        </w:rPr>
-      </w:pPr>
-      <w:r>
-        <w:rPr>
-          <w:lang w:val="en-US"/>
-        </w:rPr>
-        <w:t xml:space="preserve">golem_utils_ui.R </w:t>
-      </w:r>
-      <w:r>
-        <w:rPr>
-          <w:lang w:val="en-US"/>
-        </w:rPr>
-        <w:tab/>
-        <w:t>Same as above, but for ui functions.</w:t>
-      </w:r>
-    </w:p>
-    <w:p>
-      <w:pPr>
-        <w:ind w:left="2124" w:hanging="2124"/>
-        <w:rPr>
-          <w:lang w:val="en-US"/>
-        </w:rPr>
-      </w:pPr>
-      <w:r>
-        <w:rPr>
-          <w:lang w:val="en-US"/>
-        </w:rPr>
-        <w:t>run_app.R</w:t>
-      </w:r>
-      <w:r>
-        <w:rPr>
-          <w:lang w:val="en-US"/>
-        </w:rPr>
-        <w:tab/>
-        <w:t>File used to launch your app, don’t change.</w:t>
-      </w:r>
-    </w:p>
-    <w:p>
-      <w:pPr>
-        <w:ind w:left="2124" w:hanging="2124"/>
-        <w:rPr>
-          <w:lang w:val="en-US"/>
-        </w:rPr>
-      </w:pPr>
-    </w:p>
-    <w:p>
-      <w:pPr>
-        <w:pStyle w:val="Heading2"/>
-        <w:rPr>
-          <w:lang w:val="en-US"/>
-        </w:rPr>
-      </w:pPr>
-      <w:r>
-        <w:rPr>
-          <w:lang w:val="en-US"/>
-        </w:rPr>
         <w:t>Other</w:t>
       </w:r>
     </w:p>
@@ -1080,12 +1399,14 @@
           <w:lang w:val="en-US"/>
         </w:rPr>
       </w:pPr>
+      <w:proofErr w:type="spellStart"/>
       <w:r>
         <w:rPr>
           <w:lang w:val="en-US"/>
         </w:rPr>
         <w:t>data.R</w:t>
       </w:r>
+      <w:proofErr w:type="spellEnd"/>
       <w:r>
         <w:rPr>
           <w:lang w:val="en-US"/>
@@ -1118,12 +1439,14 @@
           <w:lang w:val="en-US"/>
         </w:rPr>
       </w:pPr>
+      <w:proofErr w:type="spellStart"/>
       <w:r>
         <w:rPr>
           <w:lang w:val="en-US"/>
         </w:rPr>
         <w:t>utils_general.R</w:t>
       </w:r>
+      <w:proofErr w:type="spellEnd"/>
       <w:r>
         <w:rPr>
           <w:lang w:val="en-US"/>
@@ -1148,8 +1471,16 @@
         <w:rPr>
           <w:lang w:val="en-US"/>
         </w:rPr>
-        <w:t>utils-pipe.R</w:t>
-      </w:r>
+        <w:t>utils-</w:t>
+      </w:r>
+      <w:proofErr w:type="spellStart"/>
+      <w:r>
+        <w:rPr>
+          <w:lang w:val="en-US"/>
+        </w:rPr>
+        <w:t>pipe.R</w:t>
+      </w:r>
+      <w:proofErr w:type="spellEnd"/>
       <w:r>
         <w:rPr>
           <w:lang w:val="en-US"/>

</xml_diff>

<commit_message>
Start glycopeptide quality check
</commit_message>
<xml_diff>
--- a/GlycoDash_code_structure.docx
+++ b/GlycoDash_code_structure.docx
@@ -1,6 +1,6 @@
 
 <file path=word/document.xml><?xml version="1.0" encoding="utf-8"?>
-<w:document xmlns:wpc="http://schemas.microsoft.com/office/word/2010/wordprocessingCanvas" xmlns:cx="http://schemas.microsoft.com/office/drawing/2014/chartex" xmlns:cx1="http://schemas.microsoft.com/office/drawing/2015/9/8/chartex" xmlns:cx2="http://schemas.microsoft.com/office/drawing/2015/10/21/chartex" xmlns:cx3="http://schemas.microsoft.com/office/drawing/2016/5/9/chartex" xmlns:cx4="http://schemas.microsoft.com/office/drawing/2016/5/10/chartex" xmlns:cx5="http://schemas.microsoft.com/office/drawing/2016/5/11/chartex" xmlns:cx6="http://schemas.microsoft.com/office/drawing/2016/5/12/chartex" xmlns:cx7="http://schemas.microsoft.com/office/drawing/2016/5/13/chartex" xmlns:cx8="http://schemas.microsoft.com/office/drawing/2016/5/14/chartex" xmlns:mc="http://schemas.openxmlformats.org/markup-compatibility/2006" xmlns:aink="http://schemas.microsoft.com/office/drawing/2016/ink" xmlns:am3d="http://schemas.microsoft.com/office/drawing/2017/model3d" xmlns:o="urn:schemas-microsoft-com:office:office" xmlns:oel="http://schemas.microsoft.com/office/2019/extlst" xmlns:r="http://schemas.openxmlformats.org/officeDocument/2006/relationships" xmlns:m="http://schemas.openxmlformats.org/officeDocument/2006/math" xmlns:v="urn:schemas-microsoft-com:vml" xmlns:wp14="http://schemas.microsoft.com/office/word/2010/wordprocessingDrawing" xmlns:wp="http://schemas.openxmlformats.org/drawingml/2006/wordprocessingDrawing" xmlns:w10="urn:schemas-microsoft-com:office:word" xmlns:w="http://schemas.openxmlformats.org/wordprocessingml/2006/main" xmlns:w14="http://schemas.microsoft.com/office/word/2010/wordml" xmlns:w15="http://schemas.microsoft.com/office/word/2012/wordml" xmlns:w16cex="http://schemas.microsoft.com/office/word/2018/wordml/cex" xmlns:w16cid="http://schemas.microsoft.com/office/word/2016/wordml/cid" xmlns:w16="http://schemas.microsoft.com/office/word/2018/wordml" xmlns:w16sdtdh="http://schemas.microsoft.com/office/word/2020/wordml/sdtdatahash" xmlns:w16se="http://schemas.microsoft.com/office/word/2015/wordml/symex" xmlns:wpg="http://schemas.microsoft.com/office/word/2010/wordprocessingGroup" xmlns:wpi="http://schemas.microsoft.com/office/word/2010/wordprocessingInk" xmlns:wne="http://schemas.microsoft.com/office/word/2006/wordml" xmlns:wps="http://schemas.microsoft.com/office/word/2010/wordprocessingShape" mc:Ignorable="w14 w15 w16se w16cid w16 w16cex w16sdtdh wp14">
+<w:document xmlns:wpc="http://schemas.microsoft.com/office/word/2010/wordprocessingCanvas" xmlns:cx="http://schemas.microsoft.com/office/drawing/2014/chartex" xmlns:cx1="http://schemas.microsoft.com/office/drawing/2015/9/8/chartex" xmlns:cx2="http://schemas.microsoft.com/office/drawing/2015/10/21/chartex" xmlns:cx3="http://schemas.microsoft.com/office/drawing/2016/5/9/chartex" xmlns:cx4="http://schemas.microsoft.com/office/drawing/2016/5/10/chartex" xmlns:cx5="http://schemas.microsoft.com/office/drawing/2016/5/11/chartex" xmlns:cx6="http://schemas.microsoft.com/office/drawing/2016/5/12/chartex" xmlns:cx7="http://schemas.microsoft.com/office/drawing/2016/5/13/chartex" xmlns:cx8="http://schemas.microsoft.com/office/drawing/2016/5/14/chartex" xmlns:mc="http://schemas.openxmlformats.org/markup-compatibility/2006" xmlns:aink="http://schemas.microsoft.com/office/drawing/2016/ink" xmlns:am3d="http://schemas.microsoft.com/office/drawing/2017/model3d" xmlns:o="urn:schemas-microsoft-com:office:office" xmlns:oel="http://schemas.microsoft.com/office/2019/extlst" xmlns:r="http://schemas.openxmlformats.org/officeDocument/2006/relationships" xmlns:m="http://schemas.openxmlformats.org/officeDocument/2006/math" xmlns:v="urn:schemas-microsoft-com:vml" xmlns:wp14="http://schemas.microsoft.com/office/word/2010/wordprocessingDrawing" xmlns:wp="http://schemas.openxmlformats.org/drawingml/2006/wordprocessingDrawing" xmlns:w10="urn:schemas-microsoft-com:office:word" xmlns:w="http://schemas.openxmlformats.org/wordprocessingml/2006/main" xmlns:w14="http://schemas.microsoft.com/office/word/2010/wordml" xmlns:w15="http://schemas.microsoft.com/office/word/2012/wordml" xmlns:w16cex="http://schemas.microsoft.com/office/word/2018/wordml/cex" xmlns:w16cid="http://schemas.microsoft.com/office/word/2016/wordml/cid" xmlns:w16="http://schemas.microsoft.com/office/word/2018/wordml" xmlns:w16du="http://schemas.microsoft.com/office/word/2023/wordml/word16du" xmlns:w16sdtdh="http://schemas.microsoft.com/office/word/2020/wordml/sdtdatahash" xmlns:w16sdtfl="http://schemas.microsoft.com/office/word/2024/wordml/sdtformatlock" xmlns:w16se="http://schemas.microsoft.com/office/word/2015/wordml/symex" xmlns:wpg="http://schemas.microsoft.com/office/word/2010/wordprocessingGroup" xmlns:wpi="http://schemas.microsoft.com/office/word/2010/wordprocessingInk" xmlns:wne="http://schemas.microsoft.com/office/word/2006/wordml" xmlns:wps="http://schemas.microsoft.com/office/word/2010/wordprocessingShape" mc:Ignorable="w14 w15 w16se w16cid w16 w16cex w16sdtdh w16sdtfl w16du wp14">
   <w:body>
     <w:p>
       <w:pPr>
@@ -938,6 +938,27 @@
     <w:p>
       <w:pPr>
         <w:rPr>
+          <w:lang w:val="en-US"/>
+        </w:rPr>
+      </w:pPr>
+      <w:r>
+        <w:rPr>
+          <w:lang w:val="en-US"/>
+        </w:rPr>
+        <w:tab/>
+      </w:r>
+      <w:proofErr w:type="spellStart"/>
+      <w:r>
+        <w:rPr>
+          <w:lang w:val="en-US"/>
+        </w:rPr>
+        <w:t>mod_tab_quantitation_glycopeptides.R</w:t>
+      </w:r>
+      <w:proofErr w:type="spellEnd"/>
+    </w:p>
+    <w:p>
+      <w:pPr>
+        <w:rPr>
           <w:color w:val="4472C4" w:themeColor="accent1"/>
           <w:lang w:val="en-US"/>
         </w:rPr>
@@ -947,6 +968,7 @@
         <w:rPr>
           <w:lang w:val="en-US"/>
         </w:rPr>
+        <w:lastRenderedPageBreak/>
         <w:t>mod_derived_traits.R</w:t>
       </w:r>
       <w:proofErr w:type="spellEnd"/>
@@ -977,7 +999,6 @@
           <w:color w:val="4472C4" w:themeColor="accent1"/>
           <w:lang w:val="en-US"/>
         </w:rPr>
-        <w:lastRenderedPageBreak/>
         <w:tab/>
       </w:r>
       <w:proofErr w:type="spellStart"/>
@@ -1424,13 +1445,7 @@
           <w:lang w:val="en-US"/>
         </w:rPr>
         <w:tab/>
-        <w:t>Documentation on example datasets in the package</w:t>
-      </w:r>
-      <w:r>
-        <w:rPr>
-          <w:lang w:val="en-US"/>
-        </w:rPr>
-        <w:t>.</w:t>
+        <w:t>Documentation on example datasets in the package.</w:t>
       </w:r>
     </w:p>
     <w:p>
@@ -1458,7 +1473,30 @@
           <w:lang w:val="en-US"/>
         </w:rPr>
         <w:tab/>
-        <w:t>Here I wrote utility functions that I use throughout the app.</w:t>
+      </w:r>
+      <w:r>
+        <w:rPr>
+          <w:lang w:val="en-US"/>
+        </w:rPr>
+        <w:t>Contains</w:t>
+      </w:r>
+      <w:r>
+        <w:rPr>
+          <w:lang w:val="en-US"/>
+        </w:rPr>
+        <w:t xml:space="preserve"> utility functions</w:t>
+      </w:r>
+      <w:r>
+        <w:rPr>
+          <w:lang w:val="en-US"/>
+        </w:rPr>
+        <w:t xml:space="preserve"> used </w:t>
+      </w:r>
+      <w:r>
+        <w:rPr>
+          <w:lang w:val="en-US"/>
+        </w:rPr>
+        <w:t>throughout the app.</w:t>
       </w:r>
     </w:p>
     <w:p>
@@ -1513,7 +1551,7 @@
 </file>
 
 <file path=word/styles.xml><?xml version="1.0" encoding="utf-8"?>
-<w:styles xmlns:mc="http://schemas.openxmlformats.org/markup-compatibility/2006" xmlns:r="http://schemas.openxmlformats.org/officeDocument/2006/relationships" xmlns:w="http://schemas.openxmlformats.org/wordprocessingml/2006/main" xmlns:w14="http://schemas.microsoft.com/office/word/2010/wordml" xmlns:w15="http://schemas.microsoft.com/office/word/2012/wordml" xmlns:w16cex="http://schemas.microsoft.com/office/word/2018/wordml/cex" xmlns:w16cid="http://schemas.microsoft.com/office/word/2016/wordml/cid" xmlns:w16="http://schemas.microsoft.com/office/word/2018/wordml" xmlns:w16sdtdh="http://schemas.microsoft.com/office/word/2020/wordml/sdtdatahash" xmlns:w16se="http://schemas.microsoft.com/office/word/2015/wordml/symex" mc:Ignorable="w14 w15 w16se w16cid w16 w16cex w16sdtdh">
+<w:styles xmlns:mc="http://schemas.openxmlformats.org/markup-compatibility/2006" xmlns:r="http://schemas.openxmlformats.org/officeDocument/2006/relationships" xmlns:w="http://schemas.openxmlformats.org/wordprocessingml/2006/main" xmlns:w14="http://schemas.microsoft.com/office/word/2010/wordml" xmlns:w15="http://schemas.microsoft.com/office/word/2012/wordml" xmlns:w16cex="http://schemas.microsoft.com/office/word/2018/wordml/cex" xmlns:w16cid="http://schemas.microsoft.com/office/word/2016/wordml/cid" xmlns:w16="http://schemas.microsoft.com/office/word/2018/wordml" xmlns:w16du="http://schemas.microsoft.com/office/word/2023/wordml/word16du" xmlns:w16sdtdh="http://schemas.microsoft.com/office/word/2020/wordml/sdtdatahash" xmlns:w16sdtfl="http://schemas.microsoft.com/office/word/2024/wordml/sdtformatlock" xmlns:w16se="http://schemas.microsoft.com/office/word/2015/wordml/symex" mc:Ignorable="w14 w15 w16se w16cid w16 w16cex w16sdtdh w16sdtfl w16du">
   <w:docDefaults>
     <w:rPrDefault>
       <w:rPr>
@@ -2120,7 +2158,6 @@
   <w:style w:type="character" w:default="1" w:styleId="DefaultParagraphFont">
     <w:name w:val="Default Paragraph Font"/>
     <w:uiPriority w:val="1"/>
-    <w:semiHidden/>
     <w:unhideWhenUsed/>
   </w:style>
   <w:style w:type="table" w:default="1" w:styleId="TableNormal">

</xml_diff>

<commit_message>
Create container for glycopeptide correlation plots
</commit_message>
<xml_diff>
--- a/GlycoDash_code_structure.docx
+++ b/GlycoDash_code_structure.docx
@@ -941,20 +941,6 @@
           <w:lang w:val="en-US"/>
         </w:rPr>
       </w:pPr>
-      <w:r>
-        <w:rPr>
-          <w:lang w:val="en-US"/>
-        </w:rPr>
-        <w:tab/>
-      </w:r>
-      <w:proofErr w:type="spellStart"/>
-      <w:r>
-        <w:rPr>
-          <w:lang w:val="en-US"/>
-        </w:rPr>
-        <w:t>mod_tab_quantitation_glycopeptides.R</w:t>
-      </w:r>
-      <w:proofErr w:type="spellEnd"/>
     </w:p>
     <w:p>
       <w:pPr>
@@ -2158,6 +2144,7 @@
   <w:style w:type="character" w:default="1" w:styleId="DefaultParagraphFont">
     <w:name w:val="Default Paragraph Font"/>
     <w:uiPriority w:val="1"/>
+    <w:semiHidden/>
     <w:unhideWhenUsed/>
   </w:style>
   <w:style w:type="table" w:default="1" w:styleId="TableNormal">

</xml_diff>